<commit_message>
Start appendices in the Depp assignment with the AustLII jury article
Adds the opening pages of Das, Aston and Rigby 2025 as appendix A, from
the PDF the user supplied, matching the appendix format used in the two
earlier assignments.

Co-Authored-By: Claude Opus 5 <noreply@anthropic.com>
Claude-Session: https://claude.ai/code/session_01JBE53LuiqYDoXy9kPJLxew
</commit_message>
<xml_diff>
--- a/seminar-papers/עבודה מסכמת - קריאה וכתיבה אקדמית ב - דפ נגד הרד.docx
+++ b/seminar-papers/עבודה מסכמת - קריאה וכתיבה אקדמית ב - דפ נגד הרד.docx
@@ -269,7 +269,7 @@
         <w:ind w:left="709"/>
         <w:jc w:val="left"/>
       </w:pPr>
-      <w:hyperlink w:history="1" r:id="rIdv1mzgotkrqyqm48v7a-_l">
+      <w:hyperlink w:history="1" r:id="rIdp9djfoqt9gnecxdajb5wv">
         <w:r>
           <w:rPr>
             <w:rStyle w:val="Hyperlink"/>
@@ -306,7 +306,7 @@
         <w:ind w:left="709"/>
         <w:jc w:val="left"/>
       </w:pPr>
-      <w:hyperlink w:history="1" r:id="rIdeiecj7ww-u15qorogfxzb">
+      <w:hyperlink w:history="1" r:id="rIdvogcjtnc1c3s0ebtv7uwd">
         <w:r>
           <w:rPr>
             <w:rStyle w:val="Hyperlink"/>
@@ -343,7 +343,7 @@
         <w:ind w:left="709"/>
         <w:jc w:val="left"/>
       </w:pPr>
-      <w:hyperlink w:history="1" r:id="rIdjobc_vsb0c3qyrk3-pj4z">
+      <w:hyperlink w:history="1" r:id="rIdcpwt6v-nljqwzov-5ezuh">
         <w:r>
           <w:rPr>
             <w:rStyle w:val="Hyperlink"/>
@@ -515,7 +515,7 @@
         <w:ind w:left="709"/>
         <w:jc w:val="left"/>
       </w:pPr>
-      <w:hyperlink w:history="1" r:id="rIdbfxt6oklvhz59f-oluiq3">
+      <w:hyperlink w:history="1" r:id="rIdygh5dmikfhpuxiztox3gd">
         <w:r>
           <w:rPr>
             <w:rStyle w:val="Hyperlink"/>
@@ -576,7 +576,7 @@
         <w:ind w:left="709"/>
         <w:jc w:val="left"/>
       </w:pPr>
-      <w:hyperlink w:history="1" r:id="rIdcsifd6e6rtaeklobmymaz">
+      <w:hyperlink w:history="1" r:id="rIdjaqmkryw5-bv304nrdret">
         <w:r>
           <w:rPr>
             <w:rStyle w:val="Hyperlink"/>
@@ -637,7 +637,7 @@
         <w:ind w:left="709"/>
         <w:jc w:val="left"/>
       </w:pPr>
-      <w:hyperlink w:history="1" r:id="rIddit8vnpf0n5juollr17yy">
+      <w:hyperlink w:history="1" r:id="rIdxa7bm1mphp2apunkiqxz0">
         <w:r>
           <w:rPr>
             <w:rStyle w:val="Hyperlink"/>
@@ -648,6 +648,248 @@
           <w:t xml:space="preserve">https://pmc.ncbi.nlm.nih.gov/articles/PMC5732612/</w:t>
         </w:r>
       </w:hyperlink>
+    </w:p>
+    <w:p>
+      <w:pPr>
+        <w:pageBreakBefore/>
+        <w:bidi/>
+        <w:spacing w:after="240" w:line="360" w:lineRule="auto"/>
+        <w:jc w:val="start"/>
+      </w:pPr>
+      <w:r>
+        <w:rPr>
+          <w:rFonts w:ascii="Times New Roman" w:cs="David" w:eastAsia="David" w:hAnsi="Times New Roman"/>
+          <w:b/>
+          <w:bCs/>
+          <w:i w:val="false"/>
+          <w:sz w:val="32"/>
+          <w:szCs w:val="32"/>
+          <w:rtl/>
+        </w:rPr>
+        <w:t xml:space="preserve">נספחים</w:t>
+      </w:r>
+    </w:p>
+    <w:p>
+      <w:pPr>
+        <w:bidi/>
+        <w:spacing w:after="120" w:line="360" w:lineRule="auto"/>
+        <w:jc w:val="both"/>
+      </w:pPr>
+      <w:r>
+        <w:rPr>
+          <w:rFonts w:ascii="Times New Roman" w:cs="David" w:eastAsia="David" w:hAnsi="Times New Roman"/>
+          <w:b w:val="false"/>
+          <w:i w:val="false"/>
+          <w:sz w:val="24"/>
+          <w:szCs w:val="24"/>
+          <w:rtl/>
+        </w:rPr>
+        <w:t xml:space="preserve">להלן העמודים המרכזיים מן הפריטים האקדמיים ששימשו לכתיבת ראש הפרק. הפריטים המלאים מצורפים לתיבת ההגשה כנדרש בהנחיות.</w:t>
+      </w:r>
+    </w:p>
+    <w:p>
+      <w:pPr>
+        <w:bidi/>
+        <w:spacing w:after="120" w:line="360" w:lineRule="auto"/>
+        <w:jc w:val="start"/>
+      </w:pPr>
+      <w:r>
+        <w:rPr>
+          <w:rFonts w:ascii="Times New Roman" w:cs="David" w:eastAsia="David" w:hAnsi="Times New Roman"/>
+          <w:b/>
+          <w:bCs/>
+          <w:i w:val="false"/>
+          <w:sz w:val="24"/>
+          <w:szCs w:val="24"/>
+          <w:u w:val="single"/>
+          <w:rtl/>
+        </w:rPr>
+        <w:t xml:space="preserve">נספח א: Das ואחרים (2025), עמ' 220-221 (תקציר, תוכן העניינים ופתיחת המאמר)</w:t>
+      </w:r>
+    </w:p>
+    <w:p>
+      <w:pPr>
+        <w:spacing w:after="60"/>
+        <w:jc w:val="center"/>
+      </w:pPr>
+      <w:r>
+        <w:drawing>
+          <wp:inline distT="0" distB="0" distL="0" distR="0">
+            <wp:extent cx="4810125" cy="6800850"/>
+            <wp:effectExtent t="0" r="0" b="0" l="0"/>
+            <wp:docPr id="1" name="" descr="" title=""/>
+            <wp:cNvGraphicFramePr>
+              <a:graphicFrameLocks xmlns:a="http://schemas.openxmlformats.org/drawingml/2006/main" noChangeAspect="1"/>
+            </wp:cNvGraphicFramePr>
+            <a:graphic xmlns:a="http://schemas.openxmlformats.org/drawingml/2006/main">
+              <a:graphicData uri="http://schemas.openxmlformats.org/drawingml/2006/picture">
+                <pic:pic xmlns:pic="http://schemas.openxmlformats.org/drawingml/2006/picture">
+                  <pic:nvPicPr>
+                    <pic:cNvPr id="0" name="" descr=""/>
+                    <pic:cNvPicPr>
+                      <a:picLocks noChangeAspect="1" noChangeArrowheads="1"/>
+                    </pic:cNvPicPr>
+                  </pic:nvPicPr>
+                  <pic:blipFill>
+                    <a:blip r:embed="rId9" cstate="none"/>
+                    <a:srcRect/>
+                    <a:stretch>
+                      <a:fillRect/>
+                    </a:stretch>
+                  </pic:blipFill>
+                  <pic:spPr bwMode="auto">
+                    <a:xfrm>
+                      <a:off x="0" y="0"/>
+                      <a:ext cx="4810125" cy="6800850"/>
+                    </a:xfrm>
+                    <a:prstGeom prst="rect">
+                      <a:avLst/>
+                    </a:prstGeom>
+                  </pic:spPr>
+                </pic:pic>
+              </a:graphicData>
+            </a:graphic>
+          </wp:inline>
+        </w:drawing>
+      </w:r>
+    </w:p>
+    <w:p>
+      <w:pPr>
+        <w:spacing w:after="60"/>
+        <w:jc w:val="center"/>
+      </w:pPr>
+      <w:r>
+        <w:drawing>
+          <wp:inline distT="0" distB="0" distL="0" distR="0">
+            <wp:extent cx="4810125" cy="6800850"/>
+            <wp:effectExtent t="0" r="0" b="0" l="0"/>
+            <wp:docPr id="1" name="" descr="" title=""/>
+            <wp:cNvGraphicFramePr>
+              <a:graphicFrameLocks xmlns:a="http://schemas.openxmlformats.org/drawingml/2006/main" noChangeAspect="1"/>
+            </wp:cNvGraphicFramePr>
+            <a:graphic xmlns:a="http://schemas.openxmlformats.org/drawingml/2006/main">
+              <a:graphicData uri="http://schemas.openxmlformats.org/drawingml/2006/picture">
+                <pic:pic xmlns:pic="http://schemas.openxmlformats.org/drawingml/2006/picture">
+                  <pic:nvPicPr>
+                    <pic:cNvPr id="0" name="" descr=""/>
+                    <pic:cNvPicPr>
+                      <a:picLocks noChangeAspect="1" noChangeArrowheads="1"/>
+                    </pic:cNvPicPr>
+                  </pic:nvPicPr>
+                  <pic:blipFill>
+                    <a:blip r:embed="rId10" cstate="none"/>
+                    <a:srcRect/>
+                    <a:stretch>
+                      <a:fillRect/>
+                    </a:stretch>
+                  </pic:blipFill>
+                  <pic:spPr bwMode="auto">
+                    <a:xfrm>
+                      <a:off x="0" y="0"/>
+                      <a:ext cx="4810125" cy="6800850"/>
+                    </a:xfrm>
+                    <a:prstGeom prst="rect">
+                      <a:avLst/>
+                    </a:prstGeom>
+                  </pic:spPr>
+                </pic:pic>
+              </a:graphicData>
+            </a:graphic>
+          </wp:inline>
+        </w:drawing>
+      </w:r>
+    </w:p>
+    <w:p>
+      <w:pPr>
+        <w:spacing w:after="60"/>
+        <w:jc w:val="center"/>
+      </w:pPr>
+      <w:r>
+        <w:drawing>
+          <wp:inline distT="0" distB="0" distL="0" distR="0">
+            <wp:extent cx="4810125" cy="6800850"/>
+            <wp:effectExtent t="0" r="0" b="0" l="0"/>
+            <wp:docPr id="1" name="" descr="" title=""/>
+            <wp:cNvGraphicFramePr>
+              <a:graphicFrameLocks xmlns:a="http://schemas.openxmlformats.org/drawingml/2006/main" noChangeAspect="1"/>
+            </wp:cNvGraphicFramePr>
+            <a:graphic xmlns:a="http://schemas.openxmlformats.org/drawingml/2006/main">
+              <a:graphicData uri="http://schemas.openxmlformats.org/drawingml/2006/picture">
+                <pic:pic xmlns:pic="http://schemas.openxmlformats.org/drawingml/2006/picture">
+                  <pic:nvPicPr>
+                    <pic:cNvPr id="0" name="" descr=""/>
+                    <pic:cNvPicPr>
+                      <a:picLocks noChangeAspect="1" noChangeArrowheads="1"/>
+                    </pic:cNvPicPr>
+                  </pic:nvPicPr>
+                  <pic:blipFill>
+                    <a:blip r:embed="rId11" cstate="none"/>
+                    <a:srcRect/>
+                    <a:stretch>
+                      <a:fillRect/>
+                    </a:stretch>
+                  </pic:blipFill>
+                  <pic:spPr bwMode="auto">
+                    <a:xfrm>
+                      <a:off x="0" y="0"/>
+                      <a:ext cx="4810125" cy="6800850"/>
+                    </a:xfrm>
+                    <a:prstGeom prst="rect">
+                      <a:avLst/>
+                    </a:prstGeom>
+                  </pic:spPr>
+                </pic:pic>
+              </a:graphicData>
+            </a:graphic>
+          </wp:inline>
+        </w:drawing>
+      </w:r>
+    </w:p>
+    <w:p>
+      <w:pPr>
+        <w:spacing w:after="60"/>
+        <w:jc w:val="center"/>
+      </w:pPr>
+      <w:r>
+        <w:drawing>
+          <wp:inline distT="0" distB="0" distL="0" distR="0">
+            <wp:extent cx="4810125" cy="6800850"/>
+            <wp:effectExtent t="0" r="0" b="0" l="0"/>
+            <wp:docPr id="1" name="" descr="" title=""/>
+            <wp:cNvGraphicFramePr>
+              <a:graphicFrameLocks xmlns:a="http://schemas.openxmlformats.org/drawingml/2006/main" noChangeAspect="1"/>
+            </wp:cNvGraphicFramePr>
+            <a:graphic xmlns:a="http://schemas.openxmlformats.org/drawingml/2006/main">
+              <a:graphicData uri="http://schemas.openxmlformats.org/drawingml/2006/picture">
+                <pic:pic xmlns:pic="http://schemas.openxmlformats.org/drawingml/2006/picture">
+                  <pic:nvPicPr>
+                    <pic:cNvPr id="0" name="" descr=""/>
+                    <pic:cNvPicPr>
+                      <a:picLocks noChangeAspect="1" noChangeArrowheads="1"/>
+                    </pic:cNvPicPr>
+                  </pic:nvPicPr>
+                  <pic:blipFill>
+                    <a:blip r:embed="rId12" cstate="none"/>
+                    <a:srcRect/>
+                    <a:stretch>
+                      <a:fillRect/>
+                    </a:stretch>
+                  </pic:blipFill>
+                  <pic:spPr bwMode="auto">
+                    <a:xfrm>
+                      <a:off x="0" y="0"/>
+                      <a:ext cx="4810125" cy="6800850"/>
+                    </a:xfrm>
+                    <a:prstGeom prst="rect">
+                      <a:avLst/>
+                    </a:prstGeom>
+                  </pic:spPr>
+                </pic:pic>
+              </a:graphicData>
+            </a:graphic>
+          </wp:inline>
+        </w:drawing>
+      </w:r>
     </w:p>
     <w:sectPr>
       <w:headerReference w:type="default" r:id="rId7"/>

</xml_diff>